<commit_message>
docs: abstract internship experience for public portfolio (#13)
</commit_message>
<xml_diff>
--- a/cv-en.docx
+++ b/cv-en.docx
@@ -17,7 +17,7 @@
     </w:p>
     <w:p>
       <w:r>
-        <w:t>First year master’s student in the Graduate School of Information Sciences and Arts at Toyo University. I research stylized rendering from 3D scenes and design, build, and operate real time voice AI and agent systems. I also publish technical articles about what I learn.</w:t>
+        <w:t>First year master’s student in the Graduate School of Information Sciences and Arts at Toyo University. I research stylized rendering from 3D scenes and work on software development and process improvement. I also publish technical articles about what I learn.</w:t>
       </w:r>
     </w:p>
     <w:p>
@@ -87,19 +87,13 @@
         <w:t xml:space="preserve">Sep 2025–  </w:t>
       </w:r>
       <w:r>
-        <w:t>BPR Team Intern, H-POWER Holdings Co., Ltd.</w:t>
+        <w:t>Intern, H-POWER Holdings Co., Ltd.</w:t>
       </w:r>
     </w:p>
     <w:p>
       <w:pPr/>
       <w:r>
-        <w:t>Design, build, and operate internal systems for business process improvement. Independently developed proof of concepts for an AI interview SaaS product and a voice AI system. Led an API integration for case management across sales, operations, and the BPR team.</w:t>
-      </w:r>
-    </w:p>
-    <w:p>
-      <w:pPr/>
-      <w:r>
-        <w:t>99 pull requests  ·  20 recent CI runs passed  ·  7 broken deployments blocked</w:t>
+        <w:t>Contributed to shared internal systems and process improvement, from problem framing and implementation to validation and coordination with stakeholders.</w:t>
       </w:r>
     </w:p>
     <w:p>
@@ -233,7 +227,7 @@
         <w:t xml:space="preserve">AI and LLMs  </w:t>
       </w:r>
       <w:r>
-        <w:t>Gemini Live (real time voice) / Vertex AI / Claude API (Tool Use) / Local LLMs / NVIDIA ACE</w:t>
+        <w:t>Applied AI and interactive prototyping</w:t>
       </w:r>
     </w:p>
     <w:p>
@@ -244,7 +238,7 @@
         <w:t xml:space="preserve">Cloud  </w:t>
       </w:r>
       <w:r>
-        <w:t>Google Cloud (Cloud Run / Pub/Sub / Cloud SQL / Cloud Functions / GCS) / Terraform / GitHub Actions / Firebase</w:t>
+        <w:t>Google Cloud / Terraform / GitHub Actions / Firebase</w:t>
       </w:r>
     </w:p>
     <w:p>
@@ -299,7 +293,7 @@
       </w:r>
     </w:p>
     <w:sectPr>
-      <w:pgSz w:w="12240" w:h="15840"/>
+      <w:pgSz w:w="11906" w:h="16838"/>
       <w:pgMar w:top="936" w:right="1152" w:bottom="936" w:left="1152" w:header="720" w:footer="720" w:gutter="0"/>
       <w:cols w:space="720"/>
       <w:docGrid w:linePitch="360"/>

</xml_diff>